<commit_message>
fix and remove fake realisations
</commit_message>
<xml_diff>
--- a/Eco.Lab1/DesignFiles/Lab76-report.docx
+++ b/Eco.Lab1/DesignFiles/Lab76-report.docx
@@ -23,7 +23,7 @@
         <w:pStyle w:val="Date"/>
       </w:pPr>
       <w:r>
-        <w:t xml:space="preserve">11 октября 2026 года</w:t>
+        <w:t xml:space="preserve">14 октября 2026 года</w:t>
       </w:r>
     </w:p>
     <w:p>
@@ -31,10 +31,10 @@
         <w:pStyle w:val="FirstParagraph"/>
       </w:pPr>
       <w:r>
-        <w:t xml:space="preserve">Работа реализует задание № 76 из списка лабораторных задач: ACOM-компонент принимает указатель на пользовательскую функцию потерь, шаг обучения и начальный вектор весов. Отчёт следует шести этапам образца для другой задачи, но рассматривает только многомерный градиентный спуск. Нативная сборка и консольный UnitTest на macOS arm64 подтвердили численный результат, обработку ошибок и получение снимков траектории через отдельный интерфейс. Отдельный консольный пример показывает эти снимки числами и ASCII-графиком. Сходимость произвольной функции потерь не гарантируется; достижение лимита итераций обозначается отдельно от признака сходимости.</w:t>
-      </w:r>
-    </w:p>
-    <w:bookmarkStart w:id="12" w:name="алгоритм"/>
+        <w:t xml:space="preserve">Работа реализует задание № 76 из списка лабораторных задач: ACOM-компонент принимает указатель на пользовательскую функцию потерь, шаг обучения и начальный вектор весов. Отчёт следует шести этапам образца для другой задачи, но рассматривает только многомерный градиентный спуск. Нативная сборка и консольный UnitTest на macOS arm64 подтвердили численный результат, обработку ошибок и получение снимков траектории через отдельный интерфейс после переработки внутренних интерфейсных полей 14 октября 2026 года. Отдельный консольный пример показывает снимки числами и ASCII-графиком. Сходимость произвольной функции потерь не гарантируется; достижение лимита итераций обозначается отдельно от признака сходимости.</w:t>
+      </w:r>
+    </w:p>
+    <w:bookmarkStart w:id="33" w:name="алгоритм"/>
     <w:p>
       <w:pPr>
         <w:pStyle w:val="Heading1"/>
@@ -43,7 +43,7 @@
         <w:t xml:space="preserve">1 Алгоритм</w:t>
       </w:r>
     </w:p>
-    <w:bookmarkStart w:id="9" w:name="постановка-и-границы-работы"/>
+    <w:bookmarkStart w:id="30" w:name="постановка-и-границы-работы"/>
     <w:p>
       <w:pPr>
         <w:pStyle w:val="Heading2"/>
@@ -143,8 +143,8 @@
         <w:t xml:space="preserve">не добавлены: краткая формулировка № 76 требует именно вещественные веса и пользовательскую функцию потерь. Второй алгоритм и второй компонент не создавались, поскольку реализован один численный способ — градиентный спуск с центральными разностями.</w:t>
       </w:r>
     </w:p>
-    <w:bookmarkEnd w:id="9"/>
-    <w:bookmarkStart w:id="10" w:name="публичный-api-и-владение"/>
+    <w:bookmarkEnd w:id="30"/>
+    <w:bookmarkStart w:id="31" w:name="публичный-api-и-владение"/>
     <w:p>
       <w:pPr>
         <w:pStyle w:val="Heading2"/>
@@ -519,7 +519,7 @@
         <w:t xml:space="preserve"> </w:t>
       </w:r>
       <w:r>
-        <w:t xml:space="preserve">у обоих представлений оптимизатора возвращает один канонический указатель.</w:t>
+        <w:t xml:space="preserve">из всех трёх интерфейсов компонента возвращает один канонический указатель. Интерфейсные указатели указывают на поля таблиц методов внутри одного объекта; методы восстанавливают адрес объекта по смещению поля.</w:t>
       </w:r>
     </w:p>
     <w:p>
@@ -824,8 +824,8 @@
         <w:t xml:space="preserve">, остальные диагностические выходы обнулены; частичный результат не публикуется.</w:t>
       </w:r>
     </w:p>
-    <w:bookmarkEnd w:id="10"/>
-    <w:bookmarkStart w:id="11" w:name="численный-метод-и-остановка"/>
+    <w:bookmarkEnd w:id="31"/>
+    <w:bookmarkStart w:id="32" w:name="численный-метод-и-остановка"/>
     <w:p>
       <w:pPr>
         <w:pStyle w:val="Heading2"/>
@@ -997,9 +997,9 @@
         <w:t xml:space="preserve">. Финальный вызов потери относится именно к возвращаемому вектору. Непредставимая пробная точка, нулевой знаменатель, NaN/Inf и отказ выделения прекращают расчёт с освобождением временных ресурсов.</w:t>
       </w:r>
     </w:p>
-    <w:bookmarkEnd w:id="11"/>
-    <w:bookmarkEnd w:id="12"/>
-    <w:bookmarkStart w:id="13" w:name="оценка-сложности"/>
+    <w:bookmarkEnd w:id="32"/>
+    <w:bookmarkEnd w:id="33"/>
+    <w:bookmarkStart w:id="34" w:name="оценка-сложности"/>
     <w:p>
       <w:pPr>
         <w:pStyle w:val="Heading1"/>
@@ -1231,8 +1231,8 @@
         <w:t xml:space="preserve">снимков и добавляет время своего собственного callback, но не хранит историю внутри компонента.</w:t>
       </w:r>
     </w:p>
-    <w:bookmarkEnd w:id="13"/>
-    <w:bookmarkStart w:id="14" w:name="улучшения"/>
+    <w:bookmarkEnd w:id="34"/>
+    <w:bookmarkStart w:id="35" w:name="улучшения"/>
     <w:p>
       <w:pPr>
         <w:pStyle w:val="Heading1"/>
@@ -1299,8 +1299,8 @@
         <w:t xml:space="preserve">Эти свойства уже реализованы и проверены тестами; отчёт не приписывает им измеренного ускорения. Аналитический градиент, момент и адаптивный шаг не реализованы и не обозначаются как выполненные улучшения. Отдельный компонент второго алгоритма не нужен: задание № 76 не задаёт несколько обязательных способов градиентного спуска.</w:t>
       </w:r>
     </w:p>
-    <w:bookmarkEnd w:id="14"/>
-    <w:bookmarkStart w:id="19" w:name="результаты-тестирования"/>
+    <w:bookmarkEnd w:id="35"/>
+    <w:bookmarkStart w:id="40" w:name="результаты-тестирования"/>
     <w:p>
       <w:pPr>
         <w:pStyle w:val="Heading1"/>
@@ -1309,7 +1309,7 @@
         <w:t xml:space="preserve">4 Результаты тестирования</w:t>
       </w:r>
     </w:p>
-    <w:bookmarkStart w:id="15" w:name="консольная-проверка-и-точность"/>
+    <w:bookmarkStart w:id="36" w:name="консольная-проверка-и-точность"/>
     <w:p>
       <w:pPr>
         <w:pStyle w:val="Heading2"/>
@@ -1323,7 +1323,7 @@
         <w:pStyle w:val="FirstParagraph"/>
       </w:pPr>
       <w:r>
-        <w:t xml:space="preserve">Сборка выполнялась командой</w:t>
+        <w:t xml:space="preserve">После переработки внутренних интерфейсных полей сборка выполнялась командой</w:t>
       </w:r>
       <w:r>
         <w:t xml:space="preserve"> </w:t>
@@ -1335,22 +1335,7 @@
         <w:t xml:space="preserve">sh Eco.Lab1/AssemblyFiles/Mac/build-native.sh</w:t>
       </w:r>
       <w:r>
-        <w:t xml:space="preserve">; запуск UnitTest завершился кодом 0. Отрицательный контроль с</w:t>
-      </w:r>
-      <w:r>
-        <w:t xml:space="preserve"> </w:t>
-      </w:r>
-      <w:r>
-        <w:rPr>
-          <w:rStyle w:val="VerbatimChar"/>
-        </w:rPr>
-        <w:t xml:space="preserve">LAB76_NEGATIVE_CONTROL=1</w:t>
-      </w:r>
-      <w:r>
-        <w:t xml:space="preserve"> </w:t>
-      </w:r>
-      <w:r>
-        <w:t xml:space="preserve">завершился кодом 77, поэтому неверное ожидание действительно делает консольный тест неуспешным. Тест проверяет создание и независимость вектора, размерности 1, 2 и 4, MSE, замену callback, смешанный член, раннюю остановку, лимит итераций, формулу числа вызовов, неверные входы, ошибки callback и аллокатора, NaN/Inf, повторные вызовы, сохранность входа и баланс ссылок. Дополнительные утверждения проверяют начальный и последующие снимки весов, численное равенство</w:t>
+        <w:t xml:space="preserve">, а UnitTest завершился кодом 0. Текущий UnitTest использует только публичные интерфейсы реальных компонентов: он проверяет создание и независимость вектора, размерности 1, 2 и 4, MSE, замену callback, смешанный член, раннюю остановку, лимит итераций, формулу числа вызовов, неверные входы, ошибки callback, NaN/Inf, повторные вызовы, сохранность входа и баланс ссылок. Дополнительные утверждения проверяют начальный и последующие снимки весов, численное равенство</w:t>
       </w:r>
       <w:r>
         <w:t xml:space="preserve"> </w:t>
@@ -1389,7 +1374,7 @@
         <w:t xml:space="preserve">QueryInterface</w:t>
       </w:r>
       <w:r>
-        <w:t xml:space="preserve">.</w:t>
+        <w:t xml:space="preserve">. Проверка принудительного отказа аллокатора удалена вместе с поддельным аллокатором.</w:t>
       </w:r>
     </w:p>
     <w:p>
@@ -2703,8 +2688,8 @@
         <w:t xml:space="preserve">алгоритм: число его шагов не сравнивается с шестью шагами ACOM, а решение подтверждает положение известного минимума. NumPy и SciPy используются только снаружи компонента, в проверочном скрипте. MATLAB недоступен по учётной записи и не запускался.</w:t>
       </w:r>
     </w:p>
-    <w:bookmarkEnd w:id="15"/>
-    <w:bookmarkStart w:id="16" w:name="производительность"/>
+    <w:bookmarkEnd w:id="36"/>
+    <w:bookmarkStart w:id="37" w:name="производительность"/>
     <w:p>
       <w:pPr>
         <w:pStyle w:val="Heading2"/>
@@ -2766,7 +2751,7 @@
         <w:t xml:space="preserve">time.perf_counter_ns()</w:t>
       </w:r>
       <w:r>
-        <w:t xml:space="preserve">; после прогрева выполнены три набора по пять чередующихся измерений. Значения ниже — медианы полного времени процесса в миллисекундах, включая запуск Eco.</w:t>
+        <w:t xml:space="preserve">; после прогрева выполнены четыре набора по пять чередующихся измерений. Первые три набора относятся к прежней внутренней компоновке объекта, четвёртый — к текущей версии с вычислением адреса объекта по смещению. Значения ниже — медианы полного времени процесса в миллисекундах, включая запуск Eco.</w:t>
       </w:r>
     </w:p>
     <w:tbl>
@@ -3051,13 +3036,75 @@
           </w:p>
         </w:tc>
       </w:tr>
+      <w:tr>
+        <w:tc>
+          <w:tcPr>
+            <w:tcW w:w="2200" w:type="dxa"/>
+            <w:vAlign w:val="center"/>
+          </w:tcPr>
+          <w:p>
+            <w:pPr>
+              <w:pStyle w:val="Compact"/>
+              <w:jc w:val="left"/>
+            </w:pPr>
+            <w:r>
+              <w:t xml:space="preserve">После правки интерфейсов</w:t>
+            </w:r>
+          </w:p>
+        </w:tc>
+        <w:tc>
+          <w:tcPr>
+            <w:tcW w:w="2500" w:type="dxa"/>
+            <w:vAlign w:val="center"/>
+          </w:tcPr>
+          <w:p>
+            <w:pPr>
+              <w:pStyle w:val="Compact"/>
+              <w:jc w:val="right"/>
+            </w:pPr>
+            <w:r>
+              <w:t xml:space="preserve">476.563833</w:t>
+            </w:r>
+          </w:p>
+        </w:tc>
+        <w:tc>
+          <w:tcPr>
+            <w:tcW w:w="2500" w:type="dxa"/>
+            <w:vAlign w:val="center"/>
+          </w:tcPr>
+          <w:p>
+            <w:pPr>
+              <w:pStyle w:val="Compact"/>
+              <w:jc w:val="right"/>
+            </w:pPr>
+            <w:r>
+              <w:t xml:space="preserve">199.165459</w:t>
+            </w:r>
+          </w:p>
+        </w:tc>
+        <w:tc>
+          <w:tcPr>
+            <w:tcW w:w="2160" w:type="dxa"/>
+            <w:vAlign w:val="center"/>
+          </w:tcPr>
+          <w:p>
+            <w:pPr>
+              <w:pStyle w:val="Compact"/>
+              <w:jc w:val="right"/>
+            </w:pPr>
+            <w:r>
+              <w:t xml:space="preserve">2.39</w:t>
+            </w:r>
+          </w:p>
+        </w:tc>
+      </w:tr>
     </w:tbl>
     <w:p>
       <w:pPr>
         <w:pStyle w:val="BodyText"/>
       </w:pPr>
       <w:r>
-        <w:t xml:space="preserve">Полные пятнадцать отсчётов находятся в</w:t>
+        <w:t xml:space="preserve">Полные двадцать отсчётов находятся в</w:t>
       </w:r>
       <w:r>
         <w:t xml:space="preserve"> </w:t>
@@ -3069,7 +3116,7 @@
         <w:t xml:space="preserve">DesignFiles/Lab76-verification.md</w:t>
       </w:r>
       <w:r>
-        <w:t xml:space="preserve">; повторяемость проверена тремя отдельными вызовами измерительного скрипта. Замер использует прежний</w:t>
+        <w:t xml:space="preserve">; повторяемость проверена отдельными вызовами измерительного скрипта. Замер использует</w:t>
       </w:r>
       <w:r>
         <w:t xml:space="preserve"> </w:t>
@@ -3087,8 +3134,8 @@
         <w:t xml:space="preserve">без observer; стоимость визуализации в эти числа не входит. Разница включает ACOM-диспетчеризацию, проверки входов и арифметики, копирование и выделение выходного вектора. Она не является измерением одного арифметического цикла. Эталонный C-клиент и внешний Python-измеритель не подключены к реализации компонента.</w:t>
       </w:r>
     </w:p>
-    <w:bookmarkEnd w:id="16"/>
-    <w:bookmarkStart w:id="17" w:name="сравнительный-анализ"/>
+    <w:bookmarkEnd w:id="37"/>
+    <w:bookmarkStart w:id="38" w:name="сравнительный-анализ"/>
     <w:p>
       <w:pPr>
         <w:pStyle w:val="Heading2"/>
@@ -3461,7 +3508,19 @@
         <w:t xml:space="preserve"> </w:t>
       </w:r>
       <w:r>
-        <w:t xml:space="preserve">её вызову за запуск. Три медианы дают отношение полного времени</w:t>
+        <w:t xml:space="preserve">её вызову за запуск. После правки интерфейсов отношение полного времени составило</w:t>
+      </w:r>
+      <w:r>
+        <w:t xml:space="preserve"> </w:t>
+      </w:r>
+      <w:r>
+        <w:rPr>
+          <w:rStyle w:val="VerbatimChar"/>
+        </w:rPr>
+        <w:t xml:space="preserve">2.39</w:t>
+      </w:r>
+      <w:r>
+        <w:t xml:space="preserve">: в этих условиях ACOM медленнее эталона. Три прежних набора дали</w:t>
       </w:r>
       <w:r>
         <w:t xml:space="preserve"> </w:t>
@@ -3473,7 +3532,7 @@
         <w:t xml:space="preserve">2.26–2.27</w:t>
       </w:r>
       <w:r>
-        <w:t xml:space="preserve">: в этих условиях ACOM медленнее эталона. Замер включает не только вычисление градиента, поэтому нельзя приписать весь разрыв одной диспетчеризации или одному выделению памяти. В</w:t>
+        <w:t xml:space="preserve">; различие между запусками не следует приписывать одной правке без отдельного контролируемого эксперимента. Замер включает не только вычисление градиента, поэтому нельзя приписать весь разрыв одной диспетчеризации или одному выделению памяти. В</w:t>
       </w:r>
       <w:r>
         <w:t xml:space="preserve"> </w:t>
@@ -3488,11 +3547,11 @@
         <w:t xml:space="preserve"> </w:t>
       </w:r>
       <w:r>
-        <w:t xml:space="preserve">нет готового многомерного оптимизатора; время Python-скрипта с NumPy и SciPy здесь не сопоставляется с C, поскольку у него иная среда исполнения, а у BFGS ещё и другой алгоритм. Следовательно, таблица подтверждает накладные расходы всей проверяемой компонентной реализации относительно выбранного C-аналога, но не задаёт универсальное соотношение скоростей с Python или MATLAB.</w:t>
-      </w:r>
-    </w:p>
-    <w:bookmarkEnd w:id="17"/>
-    <w:bookmarkStart w:id="18" w:name="сборка-и-ограничения"/>
+        <w:t xml:space="preserve">нет готового многомерного оптимизатора; время Python-скрипта с NumPy и SciPy здесь не сопоставляется с C, поскольку у него иная среда исполнения, а у BFGS ещё и другой алгоритм. Таблица показывает стоимость всей компонентной реализации относительно выбранного C-аналога в указанных условиях.</w:t>
+      </w:r>
+    </w:p>
+    <w:bookmarkEnd w:id="38"/>
+    <w:bookmarkStart w:id="39" w:name="сборка-и-ограничения"/>
     <w:p>
       <w:pPr>
         <w:pStyle w:val="Heading2"/>
@@ -3578,9 +3637,9 @@
         <w:t xml:space="preserve">могут иметь собственные зависимости от системных библиотек — запрет проверялся на исходниках и объектах разработанного компонента и клиента, а не на стороннем готовом рантайме Eco.</w:t>
       </w:r>
     </w:p>
-    <w:bookmarkEnd w:id="18"/>
-    <w:bookmarkEnd w:id="19"/>
-    <w:bookmarkStart w:id="20" w:name="поддержка-других-компонентов"/>
+    <w:bookmarkEnd w:id="39"/>
+    <w:bookmarkEnd w:id="40"/>
+    <w:bookmarkStart w:id="41" w:name="поддержка-других-компонентов"/>
     <w:p>
       <w:pPr>
         <w:pStyle w:val="Heading1"/>
@@ -3678,7 +3737,7 @@
         <w:t xml:space="preserve">IEcoVector</w:t>
       </w:r>
       <w:r>
-        <w:t xml:space="preserve">, созданный без отдельной регистрации. Тестовый аллокатор с искусственным отказом подтвердил освобождение ресурсов на пяти позициях выделения; отдельный запуск подтвердил отсутствие утечки при ошибке observer после первого обновления.</w:t>
+        <w:t xml:space="preserve">, созданный без отдельной регистрации. Тест через публичный observer подтверждает возврат его ошибки без частичного выходного вектора.</w:t>
       </w:r>
     </w:p>
     <w:p>
@@ -3704,8 +3763,8 @@
         <w:t xml:space="preserve">сохранены.</w:t>
       </w:r>
     </w:p>
-    <w:bookmarkEnd w:id="20"/>
-    <w:bookmarkStart w:id="25" w:name="визуализация"/>
+    <w:bookmarkEnd w:id="41"/>
+    <w:bookmarkStart w:id="46" w:name="визуализация"/>
     <w:p>
       <w:pPr>
         <w:pStyle w:val="Heading1"/>
@@ -4258,7 +4317,7 @@
         <w:t xml:space="preserve">; полный путь выводит команда.</w:t>
       </w:r>
     </w:p>
-    <w:bookmarkStart w:id="24" w:name="многомерные-примеры"/>
+    <w:bookmarkStart w:id="45" w:name="многомерные-примеры"/>
     <w:p>
       <w:pPr>
         <w:pStyle w:val="Heading2"/>
@@ -4733,18 +4792,18 @@
           <ns1:inline>
             <ns1:extent cx="5212080" cy="2948940"/>
             <ns1:effectExtent b="0" l="0" r="0" t="0"/>
-            <ns1:docPr descr="Рисунок 1. Снижение относительной потери для размерностей 1, 2, 5 и 10 по наблюдаемым снимкам весов." title="" id="22" name="Picture"/>
+            <ns1:docPr descr="Рисунок 1. Снижение относительной потери для размерностей 1, 2, 5 и 10 по наблюдаемым снимкам весов." title="" id="43" name="Picture"/>
             <ns2:graphic>
               <ns2:graphicData uri="http://schemas.openxmlformats.org/drawingml/2006/picture">
                 <ns3:pic>
                   <ns3:nvPicPr>
-                    <ns3:cNvPr descr="Lab76-convergence.png" id="23" name="Picture"/>
+                    <ns3:cNvPr descr="Lab76-convergence.png" id="44" name="Picture"/>
                     <ns3:cNvPicPr>
                       <ns2:picLocks noChangeArrowheads="1" noChangeAspect="1"/>
                     </ns3:cNvPicPr>
                   </ns3:nvPicPr>
                   <ns3:blipFill>
-                    <ns2:blip ns4:embed="rId21"/>
+                    <ns2:blip ns4:embed="rId42"/>
                     <ns2:stretch>
                       <ns2:fillRect/>
                     </ns2:stretch>
@@ -4779,9 +4838,9 @@
         <w:t xml:space="preserve">Рисунок 1. Снижение относительной потери для размерностей 1, 2, 5 и 10 по наблюдаемым снимкам весов.</w:t>
       </w:r>
     </w:p>
-    <w:bookmarkEnd w:id="24"/>
-    <w:bookmarkEnd w:id="25"/>
-    <w:bookmarkStart w:id="31" w:name="X05431e446f6d33295a8112a3ef2273a6d52531b"/>
+    <w:bookmarkEnd w:id="45"/>
+    <w:bookmarkEnd w:id="46"/>
+    <w:bookmarkStart w:id="52" w:name="X05431e446f6d33295a8112a3ef2273a6d52531b"/>
     <w:p>
       <w:pPr>
         <w:pStyle w:val="Heading1"/>
@@ -4790,7 +4849,7 @@
         <w:t xml:space="preserve">7 Инжиниринг промптов и автоматизация разработки</w:t>
       </w:r>
     </w:p>
-    <w:bookmarkStart w:id="26" w:name="инструменты-контекст-и-ответственность"/>
+    <w:bookmarkStart w:id="47" w:name="инструменты-контекст-и-ответственность"/>
     <w:p>
       <w:pPr>
         <w:pStyle w:val="Heading2"/>
@@ -5016,8 +5075,8 @@
         <w:t xml:space="preserve">помогали оформлению, но алгоритмы сортировки из них не использовались.</w:t>
       </w:r>
     </w:p>
-    <w:bookmarkEnd w:id="26"/>
-    <w:bookmarkStart w:id="27" w:name="итоговая-инструкция-и-её-уточнение"/>
+    <w:bookmarkEnd w:id="47"/>
+    <w:bookmarkStart w:id="48" w:name="итоговая-инструкция-и-её-уточнение"/>
     <w:p>
       <w:pPr>
         <w:pStyle w:val="Heading2"/>
@@ -5237,8 +5296,8 @@
         <w:t xml:space="preserve">: поэтому в инструкции закреплены проверка реальных Eco-заголовков, сохранение опубликованного ABI и удаление маркеров шаблонов. Возможность получить формально похожий, но неверный градиент закрыта требованием считать все координаты в одной точке, проверкой смешанной квадратичной функции и аналитической рекурсией. После добавления наблюдаемой траектории первая форма консольной таблицы оказалась неудобной для чтения: по замечанию к визуализации уточнены выравнивание колонок и разбиение десяти весов на две группы; повторная проверка сопоставила 31 строку отчёта с живым выводом. Это история уточнения требований и исправления представления результата; она не приписывает модели незафиксированные ошибки или автоматическую «гарантию» правильности.</w:t>
       </w:r>
     </w:p>
-    <w:bookmarkEnd w:id="27"/>
-    <w:bookmarkStart w:id="29" w:name="openspec-и-проверяемые-изменения"/>
+    <w:bookmarkEnd w:id="48"/>
+    <w:bookmarkStart w:id="50" w:name="openspec-и-проверяемые-изменения"/>
     <w:p>
       <w:pPr>
         <w:pStyle w:val="Heading2"/>
@@ -5272,7 +5331,7 @@
       <w:r>
         <w:t xml:space="preserve"> </w:t>
       </w:r>
-      <w:hyperlink ns4:id="rId28">
+      <w:hyperlink ns4:id="rId49">
         <w:r>
           <w:rPr>
             <w:rStyle w:val="Hyperlink"/>
@@ -5429,8 +5488,8 @@
         <w:t xml:space="preserve">я сопоставил со сборкой, запуском UnitTest, сравнением с независимым численным эталоном и проверкой отсутствия запрещённых вызовов libc. Файлы OpenSpec остаются записью причин, решений и критериев приёмки; у скомпилированного компонента нет зависимости от них.</w:t>
       </w:r>
     </w:p>
-    <w:bookmarkEnd w:id="29"/>
-    <w:bookmarkStart w:id="30" w:name="Xe6b0f5b862138cb3f636a4d5334bfbdae9eb181"/>
+    <w:bookmarkEnd w:id="50"/>
+    <w:bookmarkStart w:id="51" w:name="Xe6b0f5b862138cb3f636a4d5334bfbdae9eb181"/>
     <w:p>
       <w:pPr>
         <w:pStyle w:val="Heading2"/>
@@ -6027,12 +6086,12 @@
         <w:t xml:space="preserve">memcpy</w:t>
       </w:r>
       <w:r>
-        <w:t xml:space="preserve">, callback не зашит под MSE, его ошибка сохраняется, а нечисловая потеря отклоняется. Сигнатура и границы владения приведены в разделе 1; полный путь освобождения ресурсов находится в реализации. Фрагмент не является самостоятельным доказательством: нативный UnitTest завершился успешно, отрицательные контроли дали ненулевой код, численные результаты сопоставлены с аналитическим эталоном, а исходники и объектные файлы проверены на libc-символы. Замеры в разделе 4 получены отдельным запуском на указанных данных; возможная недоступность Xcode и Linux/EcoOS названа прямо. Таким образом, ИИ ускорил подготовку и ревизию решения, но заключение о работоспособности основано на воспроизводимых проверках, а не на авторитете модели.</w:t>
-      </w:r>
-    </w:p>
-    <w:bookmarkEnd w:id="30"/>
-    <w:bookmarkEnd w:id="31"/>
-    <w:bookmarkStart w:id="32" w:name="вывод"/>
+        <w:t xml:space="preserve">, callback не зашит под MSE, его ошибка сохраняется, а нечисловая потеря отклоняется. Сигнатура и границы владения приведены в разделе 1; полный путь освобождения ресурсов находится в реализации. Фрагмент не является самостоятельным доказательством: после переработки интерфейсных полей нативный UnitTest завершился успешно, численные результаты сопоставлены с аналитическим эталоном, а исходники и объектные файлы проверены на libc-символы. Замеры в разделе 4 получены отдельными запусками на указанных данных. Ограничения доступных сборок названы прямо.</w:t>
+      </w:r>
+    </w:p>
+    <w:bookmarkEnd w:id="51"/>
+    <w:bookmarkEnd w:id="52"/>
+    <w:bookmarkStart w:id="53" w:name="вывод"/>
     <w:p>
       <w:pPr>
         <w:pStyle w:val="Heading1"/>
@@ -6046,16 +6105,16 @@
         <w:pStyle w:val="FirstParagraph"/>
       </w:pPr>
       <w:r>
-        <w:t xml:space="preserve">Задание № 76 выполнено в рамках одного ACOM-компонента с интерфейсом оптимизатора, отдельным интерфейсом вектора и необязательным интерфейсом наблюдения. Пользовательская функция потерь и контекст не привязаны к MSE или конкретной модели. UnitTest подтвердил численную точность, семантику остановки, ошибки, владение ссылками и траекторию; отдельный запуск показывает первые шаги при 1, 2, 5 и 10 весах в терминале. Сравнение всех снимков с NumPy и независимые минимумы SciPy подтвердили численный результат в пределах указанного допуска вывода. Замеры показывают цену компонентной оболочки относительно самостоятельной C-реализации при одинаковой математической нагрузке. Ограничение сдачи — отсутствие нативной проверки Xcode и Linux/EcoOS на этой машине; рабочая сборка и запуск на macOS arm64 воспроизводимы приложенными скриптами.</w:t>
-      </w:r>
-    </w:p>
-    <w:bookmarkEnd w:id="32"/>
+        <w:t xml:space="preserve">Задание № 76 реализовано в рамках одного ACOM-компонента с интерфейсом оптимизатора, отдельным интерфейсом вектора и необязательным интерфейсом наблюдения. Пользовательская функция потерь и контекст не привязаны к MSE или конкретной модели. UnitTest после переработки интерфейсов подтвердил численную точность, семантику остановки, ошибки, владение ссылками и траекторию; отдельный запуск показал первые шаги при 1, 2, 5 и 10 весах в терминале. Сравнение снимков с NumPy и независимые минимумы SciPy подтвердили численный результат в пределах указанного допуска вывода. Новые замеры приведены вместе с прежними и отделены от них. Нативные проверки Xcode и Linux/EcoOS недоступны на этой машине.</w:t>
+      </w:r>
+    </w:p>
+    <w:bookmarkEnd w:id="53"/>
     <w:sectPr>
       <w:footnotePr>
         <w:numRestart w:val="eachSect"/>
       </w:footnotePr>
-      <w:pgSz w:w="12240" w:h="15840"/>
-      <w:pgMar w:top="720" w:bottom="720" w:left="1152" w:right="1152" w:header="500" w:footer="500"/>
+      <w:pgSz w:h="15840" w:w="12240"/>
+      <w:pgMar w:bottom="720" w:footer="500" w:header="500" w:left="1152" w:right="1152" w:top="720"/>
     </w:sectPr>
   </w:body>
 </w:document>
@@ -6190,7 +6249,7 @@
     <w:name w:val="Normal"/>
     <w:qFormat/>
     <w:rPr>
-      <w:rFonts w:ascii="Times New Roman" w:hAnsi="Times New Roman" w:eastAsia="Times New Roman" w:cs="Times New Roman"/>
+      <w:rFonts w:ascii="Times New Roman" w:cs="Times New Roman" w:eastAsia="Times New Roman" w:hAnsi="Times New Roman"/>
       <w:color w:val="000000"/>
       <w:sz w:val="20"/>
     </w:rPr>
@@ -6204,7 +6263,7 @@
       <w:spacing w:after="100" w:before="80"/>
     </w:pPr>
     <w:rPr>
-      <w:rFonts w:ascii="Times New Roman" w:hAnsi="Times New Roman" w:eastAsia="Times New Roman" w:cs="Times New Roman"/>
+      <w:rFonts w:ascii="Times New Roman" w:cs="Times New Roman" w:eastAsia="Times New Roman" w:hAnsi="Times New Roman"/>
       <w:color w:val="000000"/>
       <w:sz w:val="20"/>
     </w:rPr>
@@ -6232,12 +6291,12 @@
     <w:qFormat/>
     <w:rsid w:val="00A10FD9"/>
     <w:pPr>
-      <w:spacing w:after="150" w:line="240" w:lineRule="auto" w:before="200"/>
+      <w:spacing w:after="150" w:before="200" w:line="240" w:lineRule="auto"/>
       <w:contextualSpacing/>
       <w:jc w:val="center"/>
     </w:pPr>
     <w:rPr>
-      <w:rFonts w:asciiTheme="majorHAnsi" w:cstheme="majorBidi" w:eastAsiaTheme="majorEastAsia" w:hAnsiTheme="majorHAnsi" w:ascii="Times New Roman" w:hAnsi="Times New Roman" w:eastAsia="Times New Roman" w:cs="Times New Roman"/>
+      <w:rFonts w:ascii="Times New Roman" w:asciiTheme="majorHAnsi" w:cs="Times New Roman" w:cstheme="majorBidi" w:eastAsia="Times New Roman" w:eastAsiaTheme="majorEastAsia" w:hAnsi="Times New Roman" w:hAnsiTheme="majorHAnsi"/>
       <w:sz w:val="38"/>
       <w:szCs w:val="56"/>
       <w:color w:val="000000"/>
@@ -6269,7 +6328,7 @@
       </w:numPr>
     </w:pPr>
     <w:rPr>
-      <w:rFonts w:cstheme="majorBidi" w:eastAsiaTheme="majorEastAsia" w:ascii="Times New Roman" w:hAnsi="Times New Roman" w:eastAsia="Times New Roman" w:cs="Times New Roman"/>
+      <w:rFonts w:ascii="Times New Roman" w:cs="Times New Roman" w:cstheme="majorBidi" w:eastAsia="Times New Roman" w:eastAsiaTheme="majorEastAsia" w:hAnsi="Times New Roman"/>
       <w:spacing w:val="15"/>
       <w:sz w:val="23"/>
       <w:szCs w:val="28"/>
@@ -6373,7 +6432,7 @@
       <w:outlineLvl w:val="0"/>
     </w:pPr>
     <w:rPr>
-      <w:rFonts w:asciiTheme="majorHAnsi" w:cstheme="majorBidi" w:eastAsiaTheme="majorEastAsia" w:hAnsiTheme="majorHAnsi" w:ascii="Times New Roman" w:hAnsi="Times New Roman" w:eastAsia="Times New Roman" w:cs="Times New Roman"/>
+      <w:rFonts w:ascii="Times New Roman" w:asciiTheme="majorHAnsi" w:cs="Times New Roman" w:cstheme="majorBidi" w:eastAsia="Times New Roman" w:eastAsiaTheme="majorEastAsia" w:hAnsi="Times New Roman" w:hAnsiTheme="majorHAnsi"/>
       <w:color w:themeColor="accent1" w:themeShade="BF" w:val="000000"/>
       <w:sz w:val="29"/>
       <w:szCs w:val="40"/>
@@ -6396,7 +6455,7 @@
       <w:outlineLvl w:val="1"/>
     </w:pPr>
     <w:rPr>
-      <w:rFonts w:asciiTheme="majorHAnsi" w:cstheme="majorBidi" w:eastAsiaTheme="majorEastAsia" w:hAnsiTheme="majorHAnsi" w:ascii="Times New Roman" w:hAnsi="Times New Roman" w:eastAsia="Times New Roman" w:cs="Times New Roman"/>
+      <w:rFonts w:ascii="Times New Roman" w:asciiTheme="majorHAnsi" w:cs="Times New Roman" w:cstheme="majorBidi" w:eastAsia="Times New Roman" w:eastAsiaTheme="majorEastAsia" w:hAnsi="Times New Roman" w:hAnsiTheme="majorHAnsi"/>
       <w:color w:themeColor="accent1" w:themeShade="BF" w:val="000000"/>
       <w:sz w:val="25"/>
       <w:szCs w:val="32"/>
@@ -6796,7 +6855,7 @@
     <w:name w:val="Verbatim Char"/>
     <w:basedOn w:val="BodyTextChar"/>
     <w:rPr>
-      <w:rFonts w:ascii="Courier New" w:hAnsi="Courier New" w:eastAsia="Courier New" w:cs="Courier New"/>
+      <w:rFonts w:ascii="Courier New" w:cs="Courier New" w:eastAsia="Courier New" w:hAnsi="Courier New"/>
       <w:sz w:val="18"/>
       <w:color w:val="000000"/>
     </w:rPr>
@@ -6837,7 +6896,7 @@
       <w:color w:themeColor="accent1" w:themeShade="BF" w:val="365F91"/>
     </w:rPr>
   </w:style>
-  <w:style w:type="paragraph" w:customStyle="1" w:styleId="SourceCode">
+  <w:style w:customStyle="1" w:styleId="SourceCode" w:type="paragraph">
     <w:name w:val="Source Code"/>
     <w:basedOn w:val="Normal"/>
     <w:link w:val="VerbatimChar"/>
@@ -6846,12 +6905,12 @@
       <w:keepLines w:val="true"/>
     </w:pPr>
     <w:rPr>
-      <w:rFonts w:ascii="Courier New" w:hAnsi="Courier New" w:eastAsia="Courier New" w:cs="Courier New"/>
+      <w:rFonts w:ascii="Courier New" w:cs="Courier New" w:eastAsia="Courier New" w:hAnsi="Courier New"/>
       <w:color w:val="000000"/>
       <w:sz w:val="18"/>
     </w:rPr>
   </w:style>
-  <w:style w:type="character" w:customStyle="1" w:styleId="KeywordTok">
+  <w:style w:customStyle="1" w:styleId="KeywordTok" w:type="character">
     <w:name w:val="KeywordTok"/>
     <w:basedOn w:val="VerbatimChar"/>
     <w:rPr>
@@ -6859,77 +6918,77 @@
       <w:color w:val="007020"/>
     </w:rPr>
   </w:style>
-  <w:style w:type="character" w:customStyle="1" w:styleId="DataTypeTok">
+  <w:style w:customStyle="1" w:styleId="DataTypeTok" w:type="character">
     <w:name w:val="DataTypeTok"/>
     <w:basedOn w:val="VerbatimChar"/>
     <w:rPr>
       <w:color w:val="902000"/>
     </w:rPr>
   </w:style>
-  <w:style w:type="character" w:customStyle="1" w:styleId="DecValTok">
+  <w:style w:customStyle="1" w:styleId="DecValTok" w:type="character">
     <w:name w:val="DecValTok"/>
     <w:basedOn w:val="VerbatimChar"/>
     <w:rPr>
       <w:color w:val="40a070"/>
     </w:rPr>
   </w:style>
-  <w:style w:type="character" w:customStyle="1" w:styleId="BaseNTok">
+  <w:style w:customStyle="1" w:styleId="BaseNTok" w:type="character">
     <w:name w:val="BaseNTok"/>
     <w:basedOn w:val="VerbatimChar"/>
     <w:rPr>
       <w:color w:val="40a070"/>
     </w:rPr>
   </w:style>
-  <w:style w:type="character" w:customStyle="1" w:styleId="FloatTok">
+  <w:style w:customStyle="1" w:styleId="FloatTok" w:type="character">
     <w:name w:val="FloatTok"/>
     <w:basedOn w:val="VerbatimChar"/>
     <w:rPr>
       <w:color w:val="40a070"/>
     </w:rPr>
   </w:style>
-  <w:style w:type="character" w:customStyle="1" w:styleId="ConstantTok">
+  <w:style w:customStyle="1" w:styleId="ConstantTok" w:type="character">
     <w:name w:val="ConstantTok"/>
     <w:basedOn w:val="VerbatimChar"/>
     <w:rPr>
       <w:color w:val="880000"/>
     </w:rPr>
   </w:style>
-  <w:style w:type="character" w:customStyle="1" w:styleId="CharTok">
+  <w:style w:customStyle="1" w:styleId="CharTok" w:type="character">
     <w:name w:val="CharTok"/>
     <w:basedOn w:val="VerbatimChar"/>
     <w:rPr>
       <w:color w:val="4070a0"/>
     </w:rPr>
   </w:style>
-  <w:style w:type="character" w:customStyle="1" w:styleId="SpecialCharTok">
+  <w:style w:customStyle="1" w:styleId="SpecialCharTok" w:type="character">
     <w:name w:val="SpecialCharTok"/>
     <w:basedOn w:val="VerbatimChar"/>
     <w:rPr>
       <w:color w:val="4070a0"/>
     </w:rPr>
   </w:style>
-  <w:style w:type="character" w:customStyle="1" w:styleId="StringTok">
+  <w:style w:customStyle="1" w:styleId="StringTok" w:type="character">
     <w:name w:val="StringTok"/>
     <w:basedOn w:val="VerbatimChar"/>
     <w:rPr>
       <w:color w:val="4070a0"/>
     </w:rPr>
   </w:style>
-  <w:style w:type="character" w:customStyle="1" w:styleId="VerbatimStringTok">
+  <w:style w:customStyle="1" w:styleId="VerbatimStringTok" w:type="character">
     <w:name w:val="VerbatimStringTok"/>
     <w:basedOn w:val="VerbatimChar"/>
     <w:rPr>
       <w:color w:val="4070a0"/>
     </w:rPr>
   </w:style>
-  <w:style w:type="character" w:customStyle="1" w:styleId="SpecialStringTok">
+  <w:style w:customStyle="1" w:styleId="SpecialStringTok" w:type="character">
     <w:name w:val="SpecialStringTok"/>
     <w:basedOn w:val="VerbatimChar"/>
     <w:rPr>
       <w:color w:val="bb6688"/>
     </w:rPr>
   </w:style>
-  <w:style w:type="character" w:customStyle="1" w:styleId="ImportTok">
+  <w:style w:customStyle="1" w:styleId="ImportTok" w:type="character">
     <w:name w:val="ImportTok"/>
     <w:basedOn w:val="VerbatimChar"/>
     <w:rPr>
@@ -6937,7 +6996,7 @@
       <w:color w:val="008000"/>
     </w:rPr>
   </w:style>
-  <w:style w:type="character" w:customStyle="1" w:styleId="CommentTok">
+  <w:style w:customStyle="1" w:styleId="CommentTok" w:type="character">
     <w:name w:val="CommentTok"/>
     <w:basedOn w:val="VerbatimChar"/>
     <w:rPr>
@@ -6945,7 +7004,7 @@
       <w:color w:val="60a0b0"/>
     </w:rPr>
   </w:style>
-  <w:style w:type="character" w:customStyle="1" w:styleId="DocumentationTok">
+  <w:style w:customStyle="1" w:styleId="DocumentationTok" w:type="character">
     <w:name w:val="DocumentationTok"/>
     <w:basedOn w:val="VerbatimChar"/>
     <w:rPr>
@@ -6953,7 +7012,7 @@
       <w:color w:val="ba2121"/>
     </w:rPr>
   </w:style>
-  <w:style w:type="character" w:customStyle="1" w:styleId="AnnotationTok">
+  <w:style w:customStyle="1" w:styleId="AnnotationTok" w:type="character">
     <w:name w:val="AnnotationTok"/>
     <w:basedOn w:val="VerbatimChar"/>
     <w:rPr>
@@ -6962,7 +7021,7 @@
       <w:color w:val="60a0b0"/>
     </w:rPr>
   </w:style>
-  <w:style w:type="character" w:customStyle="1" w:styleId="CommentVarTok">
+  <w:style w:customStyle="1" w:styleId="CommentVarTok" w:type="character">
     <w:name w:val="CommentVarTok"/>
     <w:basedOn w:val="VerbatimChar"/>
     <w:rPr>
@@ -6971,28 +7030,28 @@
       <w:color w:val="60a0b0"/>
     </w:rPr>
   </w:style>
-  <w:style w:type="character" w:customStyle="1" w:styleId="OtherTok">
+  <w:style w:customStyle="1" w:styleId="OtherTok" w:type="character">
     <w:name w:val="OtherTok"/>
     <w:basedOn w:val="VerbatimChar"/>
     <w:rPr>
       <w:color w:val="007020"/>
     </w:rPr>
   </w:style>
-  <w:style w:type="character" w:customStyle="1" w:styleId="FunctionTok">
+  <w:style w:customStyle="1" w:styleId="FunctionTok" w:type="character">
     <w:name w:val="FunctionTok"/>
     <w:basedOn w:val="VerbatimChar"/>
     <w:rPr>
       <w:color w:val="06287e"/>
     </w:rPr>
   </w:style>
-  <w:style w:type="character" w:customStyle="1" w:styleId="VariableTok">
+  <w:style w:customStyle="1" w:styleId="VariableTok" w:type="character">
     <w:name w:val="VariableTok"/>
     <w:basedOn w:val="VerbatimChar"/>
     <w:rPr>
       <w:color w:val="19177c"/>
     </w:rPr>
   </w:style>
-  <w:style w:type="character" w:customStyle="1" w:styleId="ControlFlowTok">
+  <w:style w:customStyle="1" w:styleId="ControlFlowTok" w:type="character">
     <w:name w:val="ControlFlowTok"/>
     <w:basedOn w:val="VerbatimChar"/>
     <w:rPr>
@@ -7000,45 +7059,45 @@
       <w:color w:val="007020"/>
     </w:rPr>
   </w:style>
-  <w:style w:type="character" w:customStyle="1" w:styleId="OperatorTok">
+  <w:style w:customStyle="1" w:styleId="OperatorTok" w:type="character">
     <w:name w:val="OperatorTok"/>
     <w:basedOn w:val="VerbatimChar"/>
     <w:rPr>
       <w:color w:val="666666"/>
     </w:rPr>
   </w:style>
-  <w:style w:type="character" w:customStyle="1" w:styleId="BuiltInTok">
+  <w:style w:customStyle="1" w:styleId="BuiltInTok" w:type="character">
     <w:name w:val="BuiltInTok"/>
     <w:basedOn w:val="VerbatimChar"/>
     <w:rPr>
       <w:color w:val="008000"/>
     </w:rPr>
   </w:style>
-  <w:style w:type="character" w:customStyle="1" w:styleId="ExtensionTok">
+  <w:style w:customStyle="1" w:styleId="ExtensionTok" w:type="character">
     <w:name w:val="ExtensionTok"/>
     <w:basedOn w:val="VerbatimChar"/>
     <w:rPr/>
   </w:style>
-  <w:style w:type="character" w:customStyle="1" w:styleId="PreprocessorTok">
+  <w:style w:customStyle="1" w:styleId="PreprocessorTok" w:type="character">
     <w:name w:val="PreprocessorTok"/>
     <w:basedOn w:val="VerbatimChar"/>
     <w:rPr>
       <w:color w:val="bc7a00"/>
     </w:rPr>
   </w:style>
-  <w:style w:type="character" w:customStyle="1" w:styleId="AttributeTok">
+  <w:style w:customStyle="1" w:styleId="AttributeTok" w:type="character">
     <w:name w:val="AttributeTok"/>
     <w:basedOn w:val="VerbatimChar"/>
     <w:rPr>
       <w:color w:val="7d9029"/>
     </w:rPr>
   </w:style>
-  <w:style w:type="character" w:customStyle="1" w:styleId="RegionMarkerTok">
+  <w:style w:customStyle="1" w:styleId="RegionMarkerTok" w:type="character">
     <w:name w:val="RegionMarkerTok"/>
     <w:basedOn w:val="VerbatimChar"/>
     <w:rPr/>
   </w:style>
-  <w:style w:type="character" w:customStyle="1" w:styleId="InformationTok">
+  <w:style w:customStyle="1" w:styleId="InformationTok" w:type="character">
     <w:name w:val="InformationTok"/>
     <w:basedOn w:val="VerbatimChar"/>
     <w:rPr>
@@ -7047,7 +7106,7 @@
       <w:color w:val="60a0b0"/>
     </w:rPr>
   </w:style>
-  <w:style w:type="character" w:customStyle="1" w:styleId="WarningTok">
+  <w:style w:customStyle="1" w:styleId="WarningTok" w:type="character">
     <w:name w:val="WarningTok"/>
     <w:basedOn w:val="VerbatimChar"/>
     <w:rPr>
@@ -7056,7 +7115,7 @@
       <w:color w:val="60a0b0"/>
     </w:rPr>
   </w:style>
-  <w:style w:type="character" w:customStyle="1" w:styleId="AlertTok">
+  <w:style w:customStyle="1" w:styleId="AlertTok" w:type="character">
     <w:name w:val="AlertTok"/>
     <w:basedOn w:val="VerbatimChar"/>
     <w:rPr>
@@ -7064,7 +7123,7 @@
       <w:color w:val="ff0000"/>
     </w:rPr>
   </w:style>
-  <w:style w:type="character" w:customStyle="1" w:styleId="ErrorTok">
+  <w:style w:customStyle="1" w:styleId="ErrorTok" w:type="character">
     <w:name w:val="ErrorTok"/>
     <w:basedOn w:val="VerbatimChar"/>
     <w:rPr>
@@ -7072,7 +7131,7 @@
       <w:color w:val="ff0000"/>
     </w:rPr>
   </w:style>
-  <w:style w:type="character" w:customStyle="1" w:styleId="NormalTok">
+  <w:style w:customStyle="1" w:styleId="NormalTok" w:type="character">
     <w:name w:val="NormalTok"/>
     <w:basedOn w:val="VerbatimChar"/>
     <w:rPr/>

</xml_diff>